<commit_message>
手冊更新:技術 v1.2 / 白話 v1.3(M10 30天、M11 Tailscale、規則26/動作15、Errno48 等)
- 技術實作手冊 v1.2:M10 僅顯示 30 天;M11 新增 Tailscale 與非 loopback 監聽偵測;
  RULES 26 條 / ACTIONS 15;app_server 改 ThreadingHTTPServer + 埠自動偵測(Errno 48);
  update_npm 改 npm update -g;疑難排解與檔案清單同步。
- 白話版使用手冊 v1.3:更新摘要卡與「需要你注意的事」截圖為最新去敏示範(近30天/更新全域 npm),
  新增「已常駐時重複開啟」Q&A。
- 兩份截圖皆重新去敏(範例程式/範例程序,無使用者名/主機名/真實程序名)。

Co-Authored-By: Claude Opus 4.8 <noreply@anthropic.com>
</commit_message>
<xml_diff>
--- a/MacVitals 使用手冊（白話版）.docx
+++ b/MacVitals 使用手冊（白話版）.docx
@@ -103,7 +103,7 @@
           <w:sz w:val="20"/>
           <w:szCs w:val="20"/>
         </w:rPr>
-        <w:t xml:space="preserve">版本 1.2   ·   2026-06-25</w:t>
+        <w:t xml:space="preserve">版本 1.3   ·   2026-06-25</w:t>
       </w:r>
     </w:p>
     <w:p>
@@ -169,97 +169,81 @@
       </w:pPr>
       <w:r>
         <w:rPr>
-          <w:color w:val="333333"/>
-        </w:rPr>
-        <w:t xml:space="preserve">最重要的一點:整個檢查過程是「唯讀」的——它只是「看」,不會刪除、搬移或改動你的任何檔案。只有你自己按下修復按鈕、並再次確認之後,它才會處理那一項。</w:t>
-      </w:r>
-    </w:p>
-    <w:p>
-      <w:pPr>
-        <w:pStyle w:val="Heading1"/>
-      </w:pPr>
-      <w:r>
-        <w:t xml:space="preserve">二、這給誰用 / 什麼時候用</w:t>
-      </w:r>
-    </w:p>
-    <w:p>
-      <w:pPr>
-        <w:pStyle w:val="ListParagraph"/>
-        <w:numPr>
-          <w:ilvl w:val="0"/>
-          <w:numId w:val="2"/>
-        </w:numPr>
-        <w:spacing w:after="60"/>
-      </w:pPr>
-      <w:r>
-        <w:t xml:space="preserve">覺得電腦變慢、變燙、變吵,想知道是哪裡出問題時。</w:t>
-      </w:r>
-    </w:p>
-    <w:p>
-      <w:pPr>
-        <w:pStyle w:val="ListParagraph"/>
-        <w:numPr>
-          <w:ilvl w:val="0"/>
-          <w:numId w:val="2"/>
-        </w:numPr>
-        <w:spacing w:after="60"/>
-      </w:pPr>
-      <w:r>
-        <w:t xml:space="preserve">想定期保養 Mac、清出空間、確認安全設定有沒有開好時。</w:t>
-      </w:r>
-    </w:p>
-    <w:p>
-      <w:pPr>
-        <w:pStyle w:val="ListParagraph"/>
-        <w:numPr>
-          <w:ilvl w:val="0"/>
-          <w:numId w:val="2"/>
-        </w:numPr>
-        <w:spacing w:after="60"/>
-      </w:pPr>
-      <w:r>
-        <w:t xml:space="preserve">完全不需要懂電腦指令——全程點按滑鼠就能完成。</w:t>
-      </w:r>
-    </w:p>
-    <w:p>
-      <w:pPr>
-        <w:pStyle w:val="Heading1"/>
-      </w:pPr>
-      <w:r>
-        <w:t xml:space="preserve">三、開始之前(需要準備什麼)</w:t>
-      </w:r>
-    </w:p>
-    <w:p>
-      <w:pPr>
-        <w:pStyle w:val="ListParagraph"/>
-        <w:numPr>
-          <w:ilvl w:val="0"/>
-          <w:numId w:val="2"/>
-        </w:numPr>
-        <w:spacing w:after="60"/>
-      </w:pPr>
-      <w:r>
-        <w:t xml:space="preserve">一台 Mac(macOS)。</w:t>
-      </w:r>
-    </w:p>
-    <w:p>
-      <w:pPr>
-        <w:pStyle w:val="ListParagraph"/>
-        <w:numPr>
-          <w:ilvl w:val="0"/>
-          <w:numId w:val="2"/>
-        </w:numPr>
-        <w:spacing w:after="60"/>
-      </w:pPr>
-      <w:r>
-        <w:rPr>
           <w:b/>
           <w:bCs/>
         </w:rPr>
-        <w:t xml:space="preserve">首次使用若提示安裝「開發者工具」</w:t>
-      </w:r>
-      <w:r>
-        <w:t xml:space="preserve">:按「安裝」,完成後再操作一次即可(只需一次)。</w:t>
+        <w:t xml:space="preserve">最重要的一點:</w:t>
+      </w:r>
+      <w:r>
+        <w:t xml:space="preserve">整個檢查過程是「唯讀」的——它只是「看」,不會刪除、搬移或改動你的任何檔案。只有你自己按下修復按鈕、並再次確認之後,它才會處理那一項。</w:t>
+      </w:r>
+    </w:p>
+    <w:p>
+      <w:pPr>
+        <w:pStyle w:val="Heading1"/>
+      </w:pPr>
+      <w:r>
+        <w:t xml:space="preserve">二、這給誰用 / 什麼時候用</w:t>
+      </w:r>
+    </w:p>
+    <w:p>
+      <w:pPr>
+        <w:pStyle w:val="ListParagraph"/>
+        <w:numPr>
+          <w:ilvl w:val="0"/>
+          <w:numId w:val="2"/>
+        </w:numPr>
+        <w:spacing w:after="60"/>
+      </w:pPr>
+      <w:r>
+        <w:t xml:space="preserve">覺得電腦變慢、變燙、變吵,想知道是哪裡出問題時。</w:t>
+      </w:r>
+    </w:p>
+    <w:p>
+      <w:pPr>
+        <w:pStyle w:val="ListParagraph"/>
+        <w:numPr>
+          <w:ilvl w:val="0"/>
+          <w:numId w:val="2"/>
+        </w:numPr>
+        <w:spacing w:after="60"/>
+      </w:pPr>
+      <w:r>
+        <w:t xml:space="preserve">想定期保養 Mac、清出空間、確認安全設定有沒有開好時。</w:t>
+      </w:r>
+    </w:p>
+    <w:p>
+      <w:pPr>
+        <w:pStyle w:val="ListParagraph"/>
+        <w:numPr>
+          <w:ilvl w:val="0"/>
+          <w:numId w:val="2"/>
+        </w:numPr>
+        <w:spacing w:after="60"/>
+      </w:pPr>
+      <w:r>
+        <w:t xml:space="preserve">完全不需要懂電腦指令——全程點按滑鼠就能完成。</w:t>
+      </w:r>
+    </w:p>
+    <w:p>
+      <w:pPr>
+        <w:pStyle w:val="Heading1"/>
+      </w:pPr>
+      <w:r>
+        <w:t xml:space="preserve">三、開始之前(需要準備什麼)</w:t>
+      </w:r>
+    </w:p>
+    <w:p>
+      <w:pPr>
+        <w:pStyle w:val="ListParagraph"/>
+        <w:numPr>
+          <w:ilvl w:val="0"/>
+          <w:numId w:val="2"/>
+        </w:numPr>
+        <w:spacing w:after="60"/>
+      </w:pPr>
+      <w:r>
+        <w:t xml:space="preserve">一台 Mac(macOS)。</w:t>
       </w:r>
     </w:p>
     <w:p>
@@ -276,78 +260,98 @@
           <w:b/>
           <w:bCs/>
         </w:rPr>
-        <w:t xml:space="preserve">預留約 5–10 分鐘</w:t>
-      </w:r>
-      <w:r>
-        <w:t xml:space="preserve">:全機掃描需要一點時間,硬碟越大越久。</w:t>
-      </w:r>
-    </w:p>
-    <w:p>
-      <w:pPr>
-        <w:pStyle w:val="Heading1"/>
-      </w:pPr>
-      <w:r>
-        <w:t xml:space="preserve">四、怎麼使用(四個步驟)</w:t>
-      </w:r>
-    </w:p>
-    <w:p>
-      <w:pPr>
-        <w:pStyle w:val="ListParagraph"/>
-        <w:numPr>
-          <w:ilvl w:val="0"/>
-          <w:numId w:val="3"/>
-        </w:numPr>
-        <w:spacing w:after="80" w:before="120"/>
+        <w:t xml:space="preserve">首次使用若提示安裝「開發者工具」</w:t>
+      </w:r>
+      <w:r>
+        <w:t xml:space="preserve">:按「安裝」,完成後再操作一次即可(只需一次)。</w:t>
+      </w:r>
+    </w:p>
+    <w:p>
+      <w:pPr>
+        <w:pStyle w:val="ListParagraph"/>
+        <w:numPr>
+          <w:ilvl w:val="0"/>
+          <w:numId w:val="2"/>
+        </w:numPr>
+        <w:spacing w:after="60"/>
       </w:pPr>
       <w:r>
         <w:rPr>
           <w:b/>
           <w:bCs/>
         </w:rPr>
-        <w:t xml:space="preserve">雙擊「開始體檢」</w:t>
-      </w:r>
-    </w:p>
-    <w:p>
-      <w:pPr>
-        <w:spacing w:after="120"/>
-      </w:pPr>
-      <w:r>
-        <w:t xml:space="preserve">在資料夾裡找到「開始體檢.command」,用滑鼠左鍵連點兩下。電腦會打開一個黑色小視窗,並自動開啟瀏覽器。</w:t>
-      </w:r>
-    </w:p>
-    <w:p>
-      <w:pPr>
-        <w:pBdr>
-          <w:left w:val="single" w:color="9A6700" w:sz="18"/>
-        </w:pBdr>
-        <w:shd w:fill="FBF3E2" w:val="clear"/>
-        <w:spacing w:after="120" w:before="80"/>
+        <w:t xml:space="preserve">預留約 5–10 分鐘</w:t>
+      </w:r>
+      <w:r>
+        <w:t xml:space="preserve">:全機掃描需要一點時間,硬碟越大越久。</w:t>
+      </w:r>
+    </w:p>
+    <w:p>
+      <w:pPr>
+        <w:pStyle w:val="Heading1"/>
+      </w:pPr>
+      <w:r>
+        <w:t xml:space="preserve">四、怎麼使用(四個步驟)</w:t>
+      </w:r>
+    </w:p>
+    <w:p>
+      <w:pPr>
+        <w:pStyle w:val="ListParagraph"/>
+        <w:numPr>
+          <w:ilvl w:val="0"/>
+          <w:numId w:val="3"/>
+        </w:numPr>
+        <w:spacing w:after="80" w:before="120"/>
       </w:pPr>
       <w:r>
         <w:rPr>
           <w:b/>
           <w:bCs/>
         </w:rPr>
-        <w:t xml:space="preserve">小提醒:</w:t>
-      </w:r>
-      <w:r>
-        <w:t xml:space="preserve">若第一次出現「無法打開,因為來自未識別的開發者」,請按住鍵盤 Control 鍵、用滑鼠點一下該檔案,選「打開」,再按一次「打開」(只需一次)。過程中那個黑色視窗請勿關閉,關掉程式就停止了。</w:t>
-      </w:r>
-    </w:p>
-    <w:p>
-      <w:pPr>
-        <w:pStyle w:val="ListParagraph"/>
-        <w:numPr>
-          <w:ilvl w:val="0"/>
-          <w:numId w:val="3"/>
-        </w:numPr>
-        <w:spacing w:after="80" w:before="120"/>
+        <w:t xml:space="preserve">雙擊「開始體檢」</w:t>
+      </w:r>
+    </w:p>
+    <w:p>
+      <w:pPr>
+        <w:spacing w:after="120"/>
+      </w:pPr>
+      <w:r>
+        <w:t xml:space="preserve">在資料夾裡找到「開始體檢.command」,用滑鼠左鍵連點兩下。電腦會打開一個黑色小視窗,並自動開啟瀏覽器。</w:t>
+      </w:r>
+    </w:p>
+    <w:p>
+      <w:pPr>
+        <w:pBdr>
+          <w:left w:val="single" w:color="0F6FB5" w:sz="18"/>
+        </w:pBdr>
+        <w:shd w:fill="EAF2FB" w:val="clear"/>
+        <w:spacing w:after="120" w:before="80"/>
       </w:pPr>
       <w:r>
         <w:rPr>
           <w:b/>
           <w:bCs/>
         </w:rPr>
+        <w:t xml:space="preserve">小提醒:</w:t>
+      </w:r>
+      <w:r>
+        <w:t xml:space="preserve">若第一次出現「無法打開,因為來自未識別的開發者」,請按住鍵盤 Control 鍵、用滑鼠點一下該檔案,選「打開」,再按一次「打開」(只需一次)。過程中那個黑色視窗請勿關閉,關掉程式就停止了。</w:t>
+      </w:r>
+    </w:p>
+    <w:p>
+      <w:pPr>
+        <w:pStyle w:val="ListParagraph"/>
+        <w:numPr>
+          <w:ilvl w:val="0"/>
+          <w:numId w:val="3"/>
+        </w:numPr>
+        <w:spacing w:after="80" w:before="120"/>
+      </w:pPr>
+      <w:r>
+        <w:rPr>
+          <w:b/>
+          <w:bCs/>
+        </w:rPr>
         <w:t xml:space="preserve">在網頁上按「開始體檢」</w:t>
       </w:r>
     </w:p>
@@ -367,7 +371,7 @@
       <w:r>
         <w:drawing>
           <wp:inline distT="0" distB="0" distL="0" distR="0">
-            <wp:extent cx="4381500" cy="2809875"/>
+            <wp:extent cx="4095750" cy="2628900"/>
             <wp:effectExtent t="0" r="0" b="0" l="0"/>
             <wp:docPr id="1" name="img" descr="manual screenshot" title="screenshot"/>
             <wp:cNvGraphicFramePr>
@@ -392,7 +396,7 @@
                   <pic:spPr bwMode="auto">
                     <a:xfrm>
                       <a:off x="0" y="0"/>
-                      <a:ext cx="4381500" cy="2809875"/>
+                      <a:ext cx="4095750" cy="2628900"/>
                     </a:xfrm>
                     <a:prstGeom prst="rect">
                       <a:avLst/>
@@ -454,7 +458,7 @@
       <w:r>
         <w:drawing>
           <wp:inline distT="0" distB="0" distL="0" distR="0">
-            <wp:extent cx="4381500" cy="3324225"/>
+            <wp:extent cx="4095750" cy="3105150"/>
             <wp:effectExtent t="0" r="0" b="0" l="0"/>
             <wp:docPr id="1" name="img" descr="manual screenshot" title="screenshot"/>
             <wp:cNvGraphicFramePr>
@@ -479,7 +483,7 @@
                   <pic:spPr bwMode="auto">
                     <a:xfrm>
                       <a:off x="0" y="0"/>
-                      <a:ext cx="4381500" cy="3324225"/>
+                      <a:ext cx="4095750" cy="3105150"/>
                     </a:xfrm>
                     <a:prstGeom prst="rect">
                       <a:avLst/>
@@ -534,6 +538,11 @@
       </w:r>
     </w:p>
     <w:p>
+      <w:r>
+        <w:br w:type="page"/>
+      </w:r>
+    </w:p>
+    <w:p>
       <w:pPr>
         <w:pStyle w:val="Heading1"/>
       </w:pPr>
@@ -557,7 +566,7 @@
       <w:r>
         <w:drawing>
           <wp:inline distT="0" distB="0" distL="0" distR="0">
-            <wp:extent cx="5143500" cy="1581150"/>
+            <wp:extent cx="4953000" cy="1514475"/>
             <wp:effectExtent t="0" r="0" b="0" l="0"/>
             <wp:docPr id="1" name="img" descr="manual screenshot" title="screenshot"/>
             <wp:cNvGraphicFramePr>
@@ -582,7 +591,7 @@
                   <pic:spPr bwMode="auto">
                     <a:xfrm>
                       <a:off x="0" y="0"/>
-                      <a:ext cx="5143500" cy="1581150"/>
+                      <a:ext cx="4953000" cy="1514475"/>
                     </a:xfrm>
                     <a:prstGeom prst="rect">
                       <a:avLst/>
@@ -608,7 +617,7 @@
           <w:sz w:val="18"/>
           <w:szCs w:val="18"/>
         </w:rPr>
-        <w:t xml:space="preserve">▲ 報告摘要:十一個面向一覽</w:t>
+        <w:t xml:space="preserve">▲ 報告摘要:十一個面向一覽(此為去敏示範資料)</w:t>
       </w:r>
     </w:p>
     <w:p>
@@ -674,7 +683,7 @@
         <w:rPr>
           <w:b/>
           <w:bCs/>
-          <w:color w:val="0F6FB5"/>
+          <w:color w:val="1F6390"/>
         </w:rPr>
         <w:t xml:space="preserve">藍色 = 參考,可選優化</w:t>
       </w:r>
@@ -713,7 +722,7 @@
         <w:spacing w:after="120"/>
       </w:pPr>
       <w:r>
-        <w:t xml:space="preserve">在「需要你注意的事」區塊,每一項右邊可能有一顆有顏色的修復按鈕(例如「一鍵清理快取」「更新 npm」),以及一顆「查看」按鈕。</w:t>
+        <w:t xml:space="preserve">在「需要你注意的事」區塊,每一項右邊可能有一顆有顏色的修復按鈕(例如「一鍵清理快取」「更新全域 npm」),以及一顆「查看」按鈕。</w:t>
       </w:r>
     </w:p>
     <w:p>
@@ -724,7 +733,7 @@
       <w:r>
         <w:drawing>
           <wp:inline distT="0" distB="0" distL="0" distR="0">
-            <wp:extent cx="5143500" cy="2705100"/>
+            <wp:extent cx="4857750" cy="3705225"/>
             <wp:effectExtent t="0" r="0" b="0" l="0"/>
             <wp:docPr id="1" name="img" descr="manual screenshot" title="screenshot"/>
             <wp:cNvGraphicFramePr>
@@ -749,7 +758,7 @@
                   <pic:spPr bwMode="auto">
                     <a:xfrm>
                       <a:off x="0" y="0"/>
-                      <a:ext cx="5143500" cy="2705100"/>
+                      <a:ext cx="4857750" cy="3705225"/>
                     </a:xfrm>
                     <a:prstGeom prst="rect">
                       <a:avLst/>
@@ -775,7 +784,7 @@
           <w:sz w:val="18"/>
           <w:szCs w:val="18"/>
         </w:rPr>
-        <w:t xml:space="preserve">▲ 「需要你注意的事」:右側即修復按鈕</w:t>
+        <w:t xml:space="preserve">▲ 「需要你注意的事」:右側即修復按鈕(此為去敏示範資料)</w:t>
       </w:r>
     </w:p>
     <w:p>
@@ -886,7 +895,23 @@
         <w:spacing w:after="120"/>
       </w:pPr>
       <w:r>
-        <w:t xml:space="preserve">A:修復需要從「開始體檢」自動打開的網頁(網址列是 127.0.0.1)操作,且黑色視窗仍開著。若你直接雙擊了報告檔(網址是 file://…)或關掉了黑色視窗,就會連不上;請重新從「開始體檢」打開的網頁操作。</w:t>
+        <w:t xml:space="preserve">A:修復需要從「開始體檢」自動打開的網頁(網址列是 127.0.0.1)操作,且黑色視窗仍開著。若你直接雙擊了報告檔(網址是 file://…)或關掉了黑色視窗,就會連不上;請重新從「開始體檢」打開的網頁操作。報告偵測到這情況時,會在最上方顯示黃色提示告訴你怎麼做。</w:t>
+      </w:r>
+    </w:p>
+    <w:p>
+      <w:pPr>
+        <w:pStyle w:val="Heading2"/>
+      </w:pPr>
+      <w:r>
+        <w:t xml:space="preserve">Q:我已經有在背景常駐執行,再雙擊「開始體檢」會怎樣?</w:t>
+      </w:r>
+    </w:p>
+    <w:p>
+      <w:pPr>
+        <w:spacing w:after="120"/>
+      </w:pPr>
+      <w:r>
+        <w:t xml:space="preserve">A:不會出錯。程式會發現「已經在執行中」,直接幫你打開報告網頁,不會重複啟動,也不會卡住。</w:t>
       </w:r>
     </w:p>
     <w:p>
@@ -947,7 +972,6 @@
         <w:rPr>
           <w:i/>
           <w:iCs/>
-          <w:color w:val="777777"/>
         </w:rPr>
         <w:t xml:space="preserve">— 祝你的 Mac 常保健康 —</w:t>
       </w:r>
@@ -1016,7 +1040,7 @@
         <w:sz w:val="16"/>
         <w:szCs w:val="16"/>
       </w:rPr>
-      <w:t xml:space="preserve">MacVitals 使用手冊   ·   </w:t>
+      <w:t xml:space="preserve">MacVitals   ·   </w:t>
     </w:r>
     <w:r>
       <w:rPr>

</xml_diff>